<commit_message>
Make ProfitTrack workbook Apple Numbers friendly
- Replace TEXT(), wildcard and <> criteria with numeric helper columns
  so formulas evaluate the same in Excel, Sheets and Numbers
- Swap formula-based conditional formatting for simple cellIs /
  containsText rules that Numbers keeps on import
- Top 5: no text in LARGE range; blank date no longer shows 1899
- Guide: phone/tablet/computer section with Numbers dropdown steps
- Listing: accurate device compatibility wording

Co-Authored-By: Claude Opus 5.5 <noreply@anthropic.com>
Claude-Session: https://claude.ai/code/session_01JPzyNUAq84BJUgu9eRds5E
</commit_message>
<xml_diff>
--- a/product/ProfitTrack_Listing_Copy.docx
+++ b/product/ProfitTrack_Listing_Copy.docx
@@ -191,6 +191,13 @@
                 <w:sz w:val="19"/>
               </w:rPr>
               <w:t>Excel + Google Sheets | English + Español</w:t>
+              <w:br/>
+            </w:r>
+            <w:r>
+              <w:rPr>
+                <w:sz w:val="19"/>
+              </w:rPr>
+              <w:t>📱 iPhone • Android • 💻 PC / Mac</w:t>
             </w:r>
           </w:p>
         </w:tc>
@@ -528,7 +535,7 @@
               <w:rPr>
                 <w:sz w:val="19"/>
               </w:rPr>
-              <w:t>5️⃣ QUICK START GUIDE — step-by-step setup in 5 minutes, colour legend, platform fee reference table and FAQ (English + Spanish).</w:t>
+              <w:t>5️⃣ QUICK START GUIDE — step-by-step setup in 5 minutes, colour legend, platform fee reference table, FAQ and phone/tablet tips (English + Spanish).</w:t>
               <w:br/>
             </w:r>
             <w:r>
@@ -590,7 +597,7 @@
               <w:rPr>
                 <w:sz w:val="19"/>
               </w:rPr>
-              <w:t>• Works in Microsoft Excel (2010+), Google Sheets (free) and LibreOffice</w:t>
+              <w:t>• Works on computer, phone and tablet — see compatibility below</w:t>
               <w:br/>
             </w:r>
             <w:r>
@@ -741,6 +748,54 @@
               <w:rPr>
                 <w:sz w:val="19"/>
               </w:rPr>
+              <w:t>📱💻 WORKS ON ALL YOUR DEVICES</w:t>
+              <w:br/>
+            </w:r>
+            <w:r>
+              <w:rPr>
+                <w:sz w:val="19"/>
+              </w:rPr>
+              <w:t>━━━━━━━━━━━━━━━━━━</w:t>
+              <w:br/>
+            </w:r>
+            <w:r>
+              <w:rPr>
+                <w:sz w:val="19"/>
+              </w:rPr>
+              <w:t>• Computer (Windows / Mac): Microsoft Excel 2010+ or Google Sheets in any browser</w:t>
+              <w:br/>
+            </w:r>
+            <w:r>
+              <w:rPr>
+                <w:sz w:val="19"/>
+              </w:rPr>
+              <w:t>• iPhone, iPad &amp; Android: the FREE Microsoft Excel app or the FREE Google Sheets app — everything works, including dropdowns and charts</w:t>
+              <w:br/>
+            </w:r>
+            <w:r>
+              <w:rPr>
+                <w:sz w:val="19"/>
+              </w:rPr>
+              <w:t>• Apple Numbers: formulas, dashboard, charts and alerts work. Numbers removes dropdown menus from all Excel files, so you type Platform/Status instead (the guide shows how to add the menus back)</w:t>
+              <w:br/>
+            </w:r>
+            <w:r>
+              <w:rPr>
+                <w:sz w:val="19"/>
+              </w:rPr>
+              <w:br/>
+            </w:r>
+            <w:r>
+              <w:rPr>
+                <w:sz w:val="19"/>
+              </w:rPr>
+              <w:t>━━━━━━━━━━━━━━━━━━</w:t>
+              <w:br/>
+            </w:r>
+            <w:r>
+              <w:rPr>
+                <w:sz w:val="19"/>
+              </w:rPr>
               <w:t>⚠️ PLEASE NOTE</w:t>
               <w:br/>
             </w:r>
@@ -762,14 +817,14 @@
               <w:rPr>
                 <w:sz w:val="19"/>
               </w:rPr>
-              <w:t>• You'll receive 1 Excel file (.xlsx). A free Google account is needed for Google Sheets.</w:t>
+              <w:t>• You'll receive 1 Excel file (.xlsx). A free Google account is needed for Google Sheets; the Excel phone app is free with a Microsoft account.</w:t>
               <w:br/>
             </w:r>
             <w:r>
               <w:rPr>
                 <w:sz w:val="19"/>
               </w:rPr>
-              <w:t>• Not compatible with Apple Numbers (charts may not display correctly).</w:t>
+              <w:t>• For the best experience on iPhone/iPad, use the free Excel or Google Sheets app rather than Apple Numbers.</w:t>
               <w:br/>
             </w:r>
             <w:r>
@@ -1524,7 +1579,7 @@
               <w:rPr>
                 <w:sz w:val="19"/>
               </w:rPr>
-              <w:t>• Software incompatibility (e.g. Apple Numbers or very old versions of Excel)</w:t>
+              <w:t>• Limitations of other apps described in the listing (e.g. Apple Numbers removing dropdown menus) or very old versions of Excel</w:t>
               <w:br/>
             </w:r>
             <w:r>
@@ -2307,7 +2362,15 @@
         <w:t xml:space="preserve">☐ </w:t>
       </w:r>
       <w:r>
-        <w:t>Extra images: Tracker with the low-margin alert, Sourcing List BUY/PASS, Quick Start Guide (bilingual), "Works in Excel &amp; Google Sheets"</w:t>
+        <w:t>Extra images: Tracker with the low-margin alert, Sourcing List BUY/PASS, Quick Start Guide (bilingual), "Works on iPhone, Android &amp; computer"</w:t>
+      </w:r>
+    </w:p>
+    <w:p>
+      <w:r>
+        <w:t xml:space="preserve">☐ </w:t>
+      </w:r>
+      <w:r>
+        <w:t>Before publishing: open the file once on your phone in the Excel app, once in Google Sheets and (if you have an iPhone) once in Numbers, and take real screenshots</w:t>
       </w:r>
     </w:p>
     <w:p>

</xml_diff>

<commit_message>
Add ProfitTrack Expenses & Mileage and Inventory trackers + bundle listing
- Expense & Mileage Tracker: expenses with business-use %, receipt
  check, mileage log that applies the IRS rate by trip date (2026:
  72.5c, 76c from Jul 1), tax-year dashboard by category and month
- Inventory Tracker: 1,000-item log, days held, fresh/watch/stale
  alerts, dashboard with stock value, sell-through, days to sell and
  10 oldest unsold items
- Shared build/common.py keeps the brand and Numbers-safe patterns
- Listing kits (md + docx) for both products and the 3-file bundle;
  ProfitTrack listing now cross-sells them

Co-Authored-By: Claude Opus 5.5 <noreply@anthropic.com>
Claude-Session: https://claude.ai/code/session_01JPzyNUAq84BJUgu9eRds5E
</commit_message>
<xml_diff>
--- a/product/ProfitTrack_Listing_Copy.docx
+++ b/product/ProfitTrack_Listing_Copy.docx
@@ -866,6 +866,19 @@
                 <w:sz w:val="19"/>
               </w:rPr>
               <w:t>Questions? Send me a message — I usually reply within 24 hours. ¿Preguntas? ¡Escríbeme!</w:t>
+              <w:br/>
+            </w:r>
+            <w:r>
+              <w:rPr>
+                <w:sz w:val="19"/>
+              </w:rPr>
+              <w:br/>
+            </w:r>
+            <w:r>
+              <w:rPr>
+                <w:sz w:val="19"/>
+              </w:rPr>
+              <w:t>💰 Pair it with ProfitTrack Inventory and ProfitTrack Expenses &amp; Mileage — or get all three in the Reseller Bundle and save.</w:t>
             </w:r>
           </w:p>
         </w:tc>
@@ -2261,7 +2274,34 @@
         <w:t>Growth ideas:</w:t>
       </w:r>
       <w:r>
-        <w:t xml:space="preserve"> Run the 50% sale for launch (the first 30 days), then drop to 30–40% off. Later, bundle with an "Expense &amp; Mileage Tracker" at $19.99 to raise the average order value.</w:t>
+        <w:t xml:space="preserve"> Run the 50% sale for launch (the first 30 days), then drop to 30–40% off. Also list the two companion products (ProfitTrack Inventory and ProfitTrack Expenses, $12.99 → $6.49 each) and the 3-file Reseller Bundle ($29.99 → $14.99). See </w:t>
+      </w:r>
+      <w:r>
+        <w:rPr>
+          <w:rFonts w:ascii="Consolas" w:hAnsi="Consolas"/>
+        </w:rPr>
+        <w:t>Listing_Inventory.md</w:t>
+      </w:r>
+      <w:r>
+        <w:t xml:space="preserve">, </w:t>
+      </w:r>
+      <w:r>
+        <w:rPr>
+          <w:rFonts w:ascii="Consolas" w:hAnsi="Consolas"/>
+        </w:rPr>
+        <w:t>Listing_Expense_Mileage.md</w:t>
+      </w:r>
+      <w:r>
+        <w:t xml:space="preserve"> and </w:t>
+      </w:r>
+      <w:r>
+        <w:rPr>
+          <w:rFonts w:ascii="Consolas" w:hAnsi="Consolas"/>
+        </w:rPr>
+        <w:t>Listing_Bundle.md</w:t>
+      </w:r>
+      <w:r>
+        <w:t>.</w:t>
       </w:r>
     </w:p>
     <w:p>

</xml_diff>